<commit_message>
Regenerate 320 Rose CFD package
</commit_message>
<xml_diff>
--- a/Project Rooms/Contract for Deed/reference/Rose contract prototype/320 Rose - Contract for Deed Agreement - PROTOTYPE.docx
+++ b/Project Rooms/Contract for Deed/reference/Rose contract prototype/320 Rose - Contract for Deed Agreement - PROTOTYPE.docx
@@ -4966,7 +4966,7 @@
           <w:szCs w:val="28"/>
           <w:u w:val="single"/>
         </w:rPr>
-        <w:t>Investment Services LLC, Trustee - Al Bennett, Manager</w:t>
+        <w:t>Investment Services LLC, Trustee - José Fabre Jr., Manager</w:t>
       </w:r>
     </w:p>
     <w:p>
@@ -5454,7 +5454,7 @@
     </w:p>
     <w:p>
       <w:r>
-        <w:t>I certify that the following person(s) personally appeared before me this day, each acknowledging to me that he/she/they signed the foregoing document: Al Bennett, Manager of Investment Services LLC, Trustee of 320 Rose Pl Real Estate Trust dated March, 5 2025.</w:t>
+        <w:t>I certify that the following person(s) personally appeared before me this day, each acknowledging to me that he/she/they signed the foregoing document: José Fabre Jr., Manager of Investment Services LLC, Trustee of 320 Rose Pl Real Estate Trust dated March, 5 2025.</w:t>
       </w:r>
     </w:p>
     <w:p>

</xml_diff>

<commit_message>
Apply attorney contract template edits
</commit_message>
<xml_diff>
--- a/Project Rooms/Contract for Deed/reference/Rose contract prototype/320 Rose - Contract for Deed Agreement - PROTOTYPE.docx
+++ b/Project Rooms/Contract for Deed/reference/Rose contract prototype/320 Rose - Contract for Deed Agreement - PROTOTYPE.docx
@@ -806,7 +806,6 @@
             <w:pPr>
               <w:jc w:val="right"/>
             </w:pPr>
-            <w:r/>
           </w:p>
         </w:tc>
       </w:tr>
@@ -2757,43 +2756,26 @@
         </w:rPr>
       </w:pPr>
       <w:r>
-        <w:rPr>
-          <w:b/>
-          <w:bCs/>
-          <w:szCs w:val="28"/>
-        </w:rPr>
-        <w:t xml:space="preserve">PENDING ORDERS OR ADVERSE CONDITIONS: </w:t>
-      </w:r>
-      <w:r>
-        <w:rPr>
-          <w:szCs w:val="28"/>
-        </w:rPr>
-        <w:t>If any pending order of a public agency or other matter of public record adversely affecting the property is known, said pending order or condition is set out below by the Seller:</w:t>
+        <w:t>PENDING ORDERS OR ADVERSE CONDITIONS: If any pending order of a public agency or other matter of public record adversely affecting the property is known, said pending order or condition is set out below by the Seller:</w:t>
       </w:r>
     </w:p>
     <w:p>
       <w:pPr>
         <w:pStyle w:val="t1"/>
-        <w:ind w:left="360"/>
-        <w:rPr>
-          <w:szCs w:val="28"/>
-        </w:rPr>
-      </w:pPr>
-    </w:p>
-    <w:p>
-      <w:pPr>
-        <w:pStyle w:val="t1"/>
-        <w:ind w:left="360"/>
-        <w:rPr>
-          <w:szCs w:val="28"/>
-        </w:rPr>
-      </w:pPr>
-      <w:r>
-        <w:rPr>
-          <w:szCs w:val="28"/>
-        </w:rPr>
-        <w:t>Seller shall remain responsible for the pending orders or adverse conditions listed below. These matters may remain in place during the term of this Contract. To the extent any such matter must be released, satisfied, or otherwise resolved to convey marketable title, Seller shall cause it to be released, satisfied, or otherwise resolved before or at the closing of Purchaser's future sale of the Property, unless resolved earlier or otherwise agreed in writing.</w:t>
-      </w:r>
+        <w:tabs>
+          <w:tab w:val="left" w:pos="360"/>
+          <w:tab w:val="left" w:pos="720"/>
+          <w:tab w:val="left" w:pos="3240"/>
+          <w:tab w:val="left" w:pos="7200"/>
+          <w:tab w:val="left" w:pos="8280"/>
+          <w:tab w:val="left" w:pos="9780"/>
+        </w:tabs>
+        <w:spacing w:line="264" w:lineRule="auto"/>
+        <w:jc w:val="both"/>
+        <w:rPr>
+          <w:szCs w:val="28"/>
+        </w:rPr>
+      </w:pPr>
     </w:p>
     <w:p>
       <w:pPr>
@@ -2801,7 +2783,6 @@
         <w:rPr>
           <w:b/>
           <w:bCs/>
-          <w:szCs w:val="28"/>
         </w:rPr>
       </w:pPr>
       <w:r>
@@ -2810,37 +2791,54 @@
           <w:bCs/>
         </w:rPr>
         <w:t>1st mortgage to Shellpoint of 122,713.02</w:t>
+      </w:r>
+      <w:r>
+        <w:rPr>
+          <w:b/>
+          <w:bCs/>
+        </w:rPr>
         <w:br/>
         <w:t>Deferred Balance of 54,532.00</w:t>
+      </w:r>
+      <w:r>
+        <w:rPr>
+          <w:b/>
+          <w:bCs/>
+        </w:rPr>
         <w:br/>
-        <w:t>A lien of 100,000.00</w:t>
-      </w:r>
-      <w:r>
-        <w:rPr>
-          <w:b/>
-          <w:bCs/>
-        </w:rPr>
-      </w:r>
-      <w:r>
-        <w:rPr>
-          <w:b/>
-          <w:bCs/>
-        </w:rPr>
-      </w:r>
-      <w:proofErr w:type="gramStart"/>
-      <w:r>
-        <w:rPr>
-          <w:b/>
-          <w:bCs/>
-        </w:rPr>
-      </w:r>
-      <w:proofErr w:type="gramEnd"/>
-      <w:r>
-        <w:rPr>
-          <w:b/>
-          <w:bCs/>
-        </w:rPr>
-      </w:r>
+        <w:t>100,000 Private Note to Neal Isaacs</w:t>
+      </w:r>
+    </w:p>
+    <w:p>
+      <w:pPr>
+        <w:jc w:val="center"/>
+        <w:rPr>
+          <w:b/>
+          <w:bCs/>
+        </w:rPr>
+      </w:pPr>
+    </w:p>
+    <w:p>
+      <w:pPr>
+        <w:rPr>
+          <w:szCs w:val="28"/>
+        </w:rPr>
+      </w:pPr>
+      <w:r>
+        <w:rPr>
+          <w:szCs w:val="28"/>
+        </w:rPr>
+        <w:t>Seller shall remain responsible for the pending orders or adverse conditions listed above. These matters may remain in place during the term of this Contract. To the extent any such matter must be released, satisfied, or otherwise resolved to convey marketable title upon completion of this Agreement’s term, Seller shall cause it to be released, satisfied, or otherwise resolved before or upon payment of all amounts due herein, unless resolved earlier or otherwise agreed in writing.</w:t>
+      </w:r>
+    </w:p>
+    <w:p>
+      <w:pPr>
+        <w:rPr>
+          <w:b/>
+          <w:bCs/>
+          <w:szCs w:val="28"/>
+        </w:rPr>
+      </w:pPr>
     </w:p>
     <w:p>
       <w:pPr>
@@ -2859,6 +2857,7 @@
           <w:bCs/>
           <w:szCs w:val="28"/>
         </w:rPr>
+        <w:lastRenderedPageBreak/>
         <w:t>RIGHT TO CURE DEFAULT</w:t>
       </w:r>
       <w:r>
@@ -2874,14 +2873,7 @@
         <w:rPr>
           <w:szCs w:val="24"/>
         </w:rPr>
-        <w:t xml:space="preserve">A PURCHASER’S RIGHTS UNDER A CONTRACT FOR DEED SHALL NOT BE FORFEITED EXCEPT AS PROVIDED IN N.C. GEN. </w:t>
-      </w:r>
-      <w:r>
-        <w:rPr>
-          <w:szCs w:val="24"/>
-        </w:rPr>
-        <w:lastRenderedPageBreak/>
-        <w:t xml:space="preserve">STAT. CHAPTER 47H. A CONTRACT FOR DEED CANNOT BE FORFEITED UNLESS A BREACH HAS OCCURRED IN ONE OR MORE OF </w:t>
+        <w:t xml:space="preserve">A PURCHASER’S RIGHTS UNDER A CONTRACT FOR DEED SHALL NOT BE FORFEITED EXCEPT AS PROVIDED IN N.C. GEN. STAT. CHAPTER 47H. A CONTRACT FOR DEED CANNOT BE FORFEITED UNLESS A BREACH HAS OCCURRED IN ONE OR MORE OF </w:t>
       </w:r>
       <w:proofErr w:type="gramStart"/>
       <w:r>
@@ -3364,6 +3356,7 @@
         <w:rPr>
           <w:szCs w:val="28"/>
         </w:rPr>
+        <w:lastRenderedPageBreak/>
         <w:t xml:space="preserve">Purchaser </w:t>
       </w:r>
       <w:r>
@@ -3393,14 +3386,7 @@
         <w:rPr>
           <w:szCs w:val="28"/>
         </w:rPr>
-        <w:t xml:space="preserve"> has not inspected the property and HAS NOT RELIED UPON ANY REPRESENTATIONS MADE BY ANY REAL ESTATE AGENT in describing the property, and Purchaser accepts the property in its PRESENT AS IS CONDITION, except as </w:t>
-      </w:r>
-      <w:r>
-        <w:rPr>
-          <w:szCs w:val="28"/>
-        </w:rPr>
-        <w:lastRenderedPageBreak/>
-        <w:t>otherwise specified herein.</w:t>
+        <w:t xml:space="preserve"> has not inspected the property and HAS NOT RELIED UPON ANY REPRESENTATIONS MADE BY ANY REAL ESTATE AGENT in describing the property, and Purchaser accepts the property in its PRESENT AS IS CONDITION, except as otherwise specified herein.</w:t>
       </w:r>
     </w:p>
     <w:p>
@@ -3543,7 +3529,15 @@
         <w:rPr>
           <w:szCs w:val="28"/>
         </w:rPr>
-        <w:t xml:space="preserve">days after the date of acceptance, or   </w:t>
+        <w:t>days after full performance of the Buyer of this Agreement’s payment terms.</w:t>
+      </w:r>
+      <w:r>
+        <w:rPr>
+          <w:b/>
+          <w:bCs/>
+          <w:szCs w:val="28"/>
+        </w:rPr>
+        <w:t xml:space="preserve"> </w:t>
       </w:r>
     </w:p>
     <w:p>
@@ -3769,19 +3763,21 @@
         <w:rPr>
           <w:bCs/>
         </w:rPr>
-        <w:t>This Contract is signed subject to any changes Seller's attorney may make or require. The parties shall sign the Contract again at closing, or execute any required amendment, with any such attorney-required alterations incorporated. If such changes are material and Purchaser does not agree to proceed, Seller may elect to proceed under the previously signed Contract. If Seller does not so elect, Purchaser's due diligence funds shall be returned to Purchaser.</w:t>
+        <w:t xml:space="preserve">This Contract is signed subject to any changes Seller's attorney may make or require. The parties shall sign the Contract again at closing, or execute any required amendment, with any such attorney-required alterations incorporated. If such changes are material and Purchaser does not agree to proceed, Seller may elect to proceed under the previously signed Contract. If Seller does </w:t>
       </w:r>
       <w:proofErr w:type="gramStart"/>
       <w:r>
         <w:rPr>
           <w:bCs/>
         </w:rPr>
+        <w:t>not so</w:t>
       </w:r>
       <w:proofErr w:type="gramEnd"/>
       <w:r>
         <w:rPr>
           <w:bCs/>
         </w:rPr>
+        <w:t xml:space="preserve"> elect, Purchaser's due diligence funds shall be returned to Purchaser.</w:t>
       </w:r>
     </w:p>
     <w:p>
@@ -5009,61 +5005,70 @@
         <w:rPr>
           <w:szCs w:val="28"/>
         </w:rPr>
-        <w:t>[ ] Agent   [X] Seller, by the signature below, acknowledge receipt of $6,000.00 [  ] Cash   [   ] Check, as earnest money deposit, which is credited toward the total down payment mentioned in paragraph 1A of this Agreement. The remaining down payment balance of $14,790.00 shall be paid at closing.</w:t>
+        <w:t>[ ]</w:t>
       </w:r>
       <w:proofErr w:type="gramEnd"/>
       <w:r>
         <w:rPr>
           <w:szCs w:val="28"/>
         </w:rPr>
+        <w:t xml:space="preserve"> Agent</w:t>
       </w:r>
       <w:proofErr w:type="gramStart"/>
       <w:r>
         <w:rPr>
           <w:szCs w:val="28"/>
         </w:rPr>
+        <w:t xml:space="preserve">   [</w:t>
       </w:r>
       <w:proofErr w:type="gramEnd"/>
       <w:r>
         <w:rPr>
           <w:szCs w:val="28"/>
         </w:rPr>
+        <w:t xml:space="preserve">X] Seller, by the signature below, acknowledge receipt of $6,000.00 </w:t>
       </w:r>
       <w:proofErr w:type="gramStart"/>
       <w:r>
         <w:rPr>
           <w:szCs w:val="28"/>
         </w:rPr>
+        <w:t>[  ]</w:t>
       </w:r>
       <w:proofErr w:type="gramEnd"/>
       <w:r>
         <w:rPr>
           <w:szCs w:val="28"/>
         </w:rPr>
+        <w:t xml:space="preserve"> Cash</w:t>
       </w:r>
       <w:proofErr w:type="gramStart"/>
       <w:r>
         <w:rPr>
           <w:szCs w:val="28"/>
         </w:rPr>
+        <w:t xml:space="preserve">   [</w:t>
       </w:r>
       <w:proofErr w:type="gramEnd"/>
       <w:r>
         <w:rPr>
           <w:szCs w:val="28"/>
         </w:rPr>
+        <w:t xml:space="preserve"> </w:t>
       </w:r>
       <w:proofErr w:type="gramStart"/>
       <w:r>
         <w:rPr>
           <w:szCs w:val="28"/>
         </w:rPr>
+        <w:t xml:space="preserve">  ]</w:t>
       </w:r>
       <w:proofErr w:type="gramEnd"/>
       <w:r>
         <w:rPr>
           <w:szCs w:val="28"/>
         </w:rPr>
+        <w:t xml:space="preserve"> Check, as earnest money deposit, which is credited toward the total down payment mentioned in paragraph 1A of this Agreement. The remaining down payment balance of $14,790.00 shall be paid at closing.</w:t>
       </w:r>
     </w:p>
     <w:p>
@@ -5478,6 +5483,7 @@
       </w:r>
     </w:p>
     <w:sectPr>
+      <w:footerReference w:type="default" r:id="rId11"/>
       <w:pgSz w:w="12240" w:h="15840"/>
       <w:pgMar w:top="1440" w:right="1440" w:bottom="1440" w:left="1440" w:header="720" w:footer="720" w:gutter="0"/>
       <w:cols w:space="720"/>
@@ -5504,6 +5510,17 @@
     </w:p>
   </w:endnote>
 </w:endnotes>
+</file>
+
+<file path=word/footer1.xml><?xml version="1.0" encoding="utf-8"?>
+<w:ftr xmlns:wpc="http://schemas.microsoft.com/office/word/2010/wordprocessingCanvas" xmlns:cx="http://schemas.microsoft.com/office/drawing/2014/chartex" xmlns:cx1="http://schemas.microsoft.com/office/drawing/2015/9/8/chartex" xmlns:cx2="http://schemas.microsoft.com/office/drawing/2015/10/21/chartex" xmlns:cx3="http://schemas.microsoft.com/office/drawing/2016/5/9/chartex" xmlns:cx4="http://schemas.microsoft.com/office/drawing/2016/5/10/chartex" xmlns:cx5="http://schemas.microsoft.com/office/drawing/2016/5/11/chartex" xmlns:cx6="http://schemas.microsoft.com/office/drawing/2016/5/12/chartex" xmlns:cx7="http://schemas.microsoft.com/office/drawing/2016/5/13/chartex" xmlns:cx8="http://schemas.microsoft.com/office/drawing/2016/5/14/chartex" xmlns:mc="http://schemas.openxmlformats.org/markup-compatibility/2006" xmlns:aink="http://schemas.microsoft.com/office/drawing/2016/ink" xmlns:am3d="http://schemas.microsoft.com/office/drawing/2017/model3d" xmlns:o="urn:schemas-microsoft-com:office:office" xmlns:oel="http://schemas.microsoft.com/office/2019/extlst" xmlns:r="http://schemas.openxmlformats.org/officeDocument/2006/relationships" xmlns:m="http://schemas.openxmlformats.org/officeDocument/2006/math" xmlns:v="urn:schemas-microsoft-com:vml" xmlns:wp14="http://schemas.microsoft.com/office/word/2010/wordprocessingDrawing" xmlns:wp="http://schemas.openxmlformats.org/drawingml/2006/wordprocessingDrawing" xmlns:w10="urn:schemas-microsoft-com:office:word" xmlns:w="http://schemas.openxmlformats.org/wordprocessingml/2006/main" xmlns:w14="http://schemas.microsoft.com/office/word/2010/wordml" xmlns:w15="http://schemas.microsoft.com/office/word/2012/wordml" xmlns:w16cex="http://schemas.microsoft.com/office/word/2018/wordml/cex" xmlns:w16cid="http://schemas.microsoft.com/office/word/2016/wordml/cid" xmlns:w16="http://schemas.microsoft.com/office/word/2018/wordml" xmlns:w16du="http://schemas.microsoft.com/office/word/2023/wordml/word16du" xmlns:w16sdtdh="http://schemas.microsoft.com/office/word/2020/wordml/sdtdatahash" xmlns:w16sdtfl="http://schemas.microsoft.com/office/word/2024/wordml/sdtformatlock" xmlns:w16se="http://schemas.microsoft.com/office/word/2015/wordml/symex" xmlns:wpg="http://schemas.microsoft.com/office/word/2010/wordprocessingGroup" xmlns:wpi="http://schemas.microsoft.com/office/word/2010/wordprocessingInk" xmlns:wne="http://schemas.microsoft.com/office/word/2006/wordml" xmlns:wps="http://schemas.microsoft.com/office/word/2010/wordprocessingShape" mc:Ignorable="w14 w15 w16se w16cid w16 w16cex w16sdtdh w16sdtfl w16du wp14">
+  <w:p>
+    <w:pPr>
+      <w:pStyle w:val="Footer"/>
+      <w:jc w:val="center"/>
+    </w:pPr>
+  </w:p>
+</w:ftr>
 </file>
 
 <file path=word/footnotes.xml><?xml version="1.0" encoding="utf-8"?>
@@ -7009,7 +7026,6 @@
   <w:style w:type="character" w:default="1" w:styleId="DefaultParagraphFont">
     <w:name w:val="Default Paragraph Font"/>
     <w:uiPriority w:val="1"/>
-    <w:semiHidden/>
     <w:unhideWhenUsed/>
   </w:style>
   <w:style w:type="table" w:default="1" w:styleId="TableNormal">
@@ -7747,21 +7763,8 @@
 </file>
 
 <file path=customXml/item1.xml><?xml version="1.0" encoding="utf-8"?>
-<?mso-contentType ?>
-<FormTemplates xmlns="http://schemas.microsoft.com/sharepoint/v3/contenttype/forms">
-  <Display>DocumentLibraryForm</Display>
-  <Edit>DocumentLibraryForm</Edit>
-  <New>DocumentLibraryForm</New>
-</FormTemplates>
-</file>
-
-<file path=customXml/item2.xml><?xml version="1.0" encoding="utf-8"?>
-<b:Sources xmlns:b="http://schemas.openxmlformats.org/officeDocument/2006/bibliography" xmlns="http://schemas.openxmlformats.org/officeDocument/2006/bibliography" SelectedStyle="\APASixthEditionOfficeOnline.xsl" StyleName="APA" Version="6"/>
-</file>
-
-<file path=customXml/item3.xml><?xml version="1.0" encoding="utf-8"?>
-<ct:contentTypeSchema xmlns:ct="http://schemas.microsoft.com/office/2006/metadata/contentType" xmlns:ma="http://schemas.microsoft.com/office/2006/metadata/properties/metaAttributes" ct:_="" ma:_="" ma:contentTypeName="Document" ma:contentTypeID="0x010100DDC7FDB1C8256C4EA4678CC05D188078" ma:contentTypeVersion="19" ma:contentTypeDescription="Create a new document." ma:contentTypeScope="" ma:versionID="f34248c6feb9a409659c998a1ec1dffc">
-  <xsd:schema xmlns:xsd="http://www.w3.org/2001/XMLSchema" xmlns:xs="http://www.w3.org/2001/XMLSchema" xmlns:p="http://schemas.microsoft.com/office/2006/metadata/properties" xmlns:ns2="ab9fedca-001d-4cc9-b244-d9c3be5a27d3" xmlns:ns3="42cc25d9-27fe-4f07-accb-ded05ec47eee" targetNamespace="http://schemas.microsoft.com/office/2006/metadata/properties" ma:root="true" ma:fieldsID="93a0d318a9c03bd3e7af6d02869aaaab" ns2:_="" ns3:_="">
+<ct:contentTypeSchema xmlns:ct="http://schemas.microsoft.com/office/2006/metadata/contentType" xmlns:ma="http://schemas.microsoft.com/office/2006/metadata/properties/metaAttributes" ct:_="" ma:_="" ma:contentTypeName="Document" ma:contentTypeID="0x010100DDC7FDB1C8256C4EA4678CC05D188078" ma:contentTypeVersion="20" ma:contentTypeDescription="Create a new document." ma:contentTypeScope="" ma:versionID="2a9650d830cc67299a1a440994d8139a">
+  <xsd:schema xmlns:xsd="http://www.w3.org/2001/XMLSchema" xmlns:xs="http://www.w3.org/2001/XMLSchema" xmlns:p="http://schemas.microsoft.com/office/2006/metadata/properties" xmlns:ns2="ab9fedca-001d-4cc9-b244-d9c3be5a27d3" xmlns:ns3="42cc25d9-27fe-4f07-accb-ded05ec47eee" targetNamespace="http://schemas.microsoft.com/office/2006/metadata/properties" ma:root="true" ma:fieldsID="b7be75ccca685a650eabb79854d6018f" ns2:_="" ns3:_="">
     <xsd:import namespace="ab9fedca-001d-4cc9-b244-d9c3be5a27d3"/>
     <xsd:import namespace="42cc25d9-27fe-4f07-accb-ded05ec47eee"/>
     <xsd:element name="properties">
@@ -7788,6 +7791,7 @@
                 <xsd:element ref="ns2:MediaServiceObjectDetectorVersions" minOccurs="0"/>
                 <xsd:element ref="ns2:_Flow_SignoffStatus" minOccurs="0"/>
                 <xsd:element ref="ns2:MediaServiceSearchProperties" minOccurs="0"/>
+                <xsd:element ref="ns2:MediaServiceBillingMetadata" minOccurs="0"/>
               </xsd:all>
             </xsd:complexType>
           </xsd:element>
@@ -7875,6 +7879,11 @@
       </xsd:simpleType>
     </xsd:element>
     <xsd:element name="MediaServiceSearchProperties" ma:index="26" nillable="true" ma:displayName="MediaServiceSearchProperties" ma:hidden="true" ma:internalName="MediaServiceSearchProperties" ma:readOnly="true">
+      <xsd:simpleType>
+        <xsd:restriction base="dms:Note"/>
+      </xsd:simpleType>
+    </xsd:element>
+    <xsd:element name="MediaServiceBillingMetadata" ma:index="27" nillable="true" ma:displayName="MediaServiceBillingMetadata" ma:hidden="true" ma:internalName="MediaServiceBillingMetadata" ma:readOnly="true">
       <xsd:simpleType>
         <xsd:restriction base="dms:Note"/>
       </xsd:simpleType>
@@ -8020,6 +8029,19 @@
 </ct:contentTypeSchema>
 </file>
 
+<file path=customXml/item2.xml><?xml version="1.0" encoding="utf-8"?>
+<b:Sources xmlns:b="http://schemas.openxmlformats.org/officeDocument/2006/bibliography" xmlns="http://schemas.openxmlformats.org/officeDocument/2006/bibliography" SelectedStyle="\APASixthEditionOfficeOnline.xsl" StyleName="APA" Version="6"/>
+</file>
+
+<file path=customXml/item3.xml><?xml version="1.0" encoding="utf-8"?>
+<?mso-contentType ?>
+<FormTemplates xmlns="http://schemas.microsoft.com/sharepoint/v3/contenttype/forms">
+  <Display>DocumentLibraryForm</Display>
+  <Edit>DocumentLibraryForm</Edit>
+  <New>DocumentLibraryForm</New>
+</FormTemplates>
+</file>
+
 <file path=customXml/item4.xml><?xml version="1.0" encoding="utf-8"?>
 <p:properties xmlns:p="http://schemas.microsoft.com/office/2006/metadata/properties" xmlns:xsi="http://www.w3.org/2001/XMLSchema-instance" xmlns:pc="http://schemas.microsoft.com/office/infopath/2007/PartnerControls">
   <documentManagement>
@@ -8033,23 +8055,7 @@
 </file>
 
 <file path=customXml/itemProps1.xml><?xml version="1.0" encoding="utf-8"?>
-<ds:datastoreItem xmlns:ds="http://schemas.openxmlformats.org/officeDocument/2006/customXml" ds:itemID="{F7042B96-2710-4B3A-A921-FC5861D5BFEE}">
-  <ds:schemaRefs>
-    <ds:schemaRef ds:uri="http://schemas.microsoft.com/sharepoint/v3/contenttype/forms"/>
-  </ds:schemaRefs>
-</ds:datastoreItem>
-</file>
-
-<file path=customXml/itemProps2.xml><?xml version="1.0" encoding="utf-8"?>
-<ds:datastoreItem xmlns:ds="http://schemas.openxmlformats.org/officeDocument/2006/customXml" ds:itemID="{3679C442-D341-425F-8964-A65FCEFD3D9B}">
-  <ds:schemaRefs>
-    <ds:schemaRef ds:uri="http://schemas.openxmlformats.org/officeDocument/2006/bibliography"/>
-  </ds:schemaRefs>
-</ds:datastoreItem>
-</file>
-
-<file path=customXml/itemProps3.xml><?xml version="1.0" encoding="utf-8"?>
-<ds:datastoreItem xmlns:ds="http://schemas.openxmlformats.org/officeDocument/2006/customXml" ds:itemID="{2CBAA76B-A731-4B6C-8A39-C3F91F6F190E}">
+<ds:datastoreItem xmlns:ds="http://schemas.openxmlformats.org/officeDocument/2006/customXml" ds:itemID="{057DB1AA-C3CE-4735-A67C-E9A8097C0741}">
   <ds:schemaRefs>
     <ds:schemaRef ds:uri="http://schemas.microsoft.com/office/2006/metadata/contentType"/>
     <ds:schemaRef ds:uri="http://schemas.microsoft.com/office/2006/metadata/properties/metaAttributes"/>
@@ -8067,6 +8073,22 @@
 </ds:datastoreItem>
 </file>
 
+<file path=customXml/itemProps2.xml><?xml version="1.0" encoding="utf-8"?>
+<ds:datastoreItem xmlns:ds="http://schemas.openxmlformats.org/officeDocument/2006/customXml" ds:itemID="{3679C442-D341-425F-8964-A65FCEFD3D9B}">
+  <ds:schemaRefs>
+    <ds:schemaRef ds:uri="http://schemas.openxmlformats.org/officeDocument/2006/bibliography"/>
+  </ds:schemaRefs>
+</ds:datastoreItem>
+</file>
+
+<file path=customXml/itemProps3.xml><?xml version="1.0" encoding="utf-8"?>
+<ds:datastoreItem xmlns:ds="http://schemas.openxmlformats.org/officeDocument/2006/customXml" ds:itemID="{F7042B96-2710-4B3A-A921-FC5861D5BFEE}">
+  <ds:schemaRefs>
+    <ds:schemaRef ds:uri="http://schemas.microsoft.com/sharepoint/v3/contenttype/forms"/>
+  </ds:schemaRefs>
+</ds:datastoreItem>
+</file>
+
 <file path=customXml/itemProps4.xml><?xml version="1.0" encoding="utf-8"?>
 <ds:datastoreItem xmlns:ds="http://schemas.openxmlformats.org/officeDocument/2006/customXml" ds:itemID="{1A4736DD-7889-4919-A280-9BE82A810A58}">
   <ds:schemaRefs>

</xml_diff>

<commit_message>
Save edited Rose contract prototype
</commit_message>
<xml_diff>
--- a/Project Rooms/Contract for Deed/reference/Rose contract prototype/320 Rose - Contract for Deed Agreement - PROTOTYPE.docx
+++ b/Project Rooms/Contract for Deed/reference/Rose contract prototype/320 Rose - Contract for Deed Agreement - PROTOTYPE.docx
@@ -3763,7 +3763,7 @@
         <w:rPr>
           <w:bCs/>
         </w:rPr>
-        <w:t xml:space="preserve">This Contract is signed subject to any changes Seller's attorney may make or require. The parties shall sign the Contract again at closing, or execute any required amendment, with any such attorney-required alterations incorporated. If such changes are material and Purchaser does not agree to proceed, Seller may elect to proceed under the previously signed Contract. If Seller does </w:t>
+        <w:t xml:space="preserve">The parties shall sign the Contract again at closing, or execute any, with any such alterations incorporated. If such changes are material and Purchaser does not agree to proceed, Seller may elect to proceed under the previously signed Contract. If Seller does </w:t>
       </w:r>
       <w:proofErr w:type="gramStart"/>
       <w:r>
@@ -7026,6 +7026,7 @@
   <w:style w:type="character" w:default="1" w:styleId="DefaultParagraphFont">
     <w:name w:val="Default Paragraph Font"/>
     <w:uiPriority w:val="1"/>
+    <w:semiHidden/>
     <w:unhideWhenUsed/>
   </w:style>
   <w:style w:type="table" w:default="1" w:styleId="TableNormal">
@@ -7763,6 +7764,19 @@
 </file>
 
 <file path=customXml/item1.xml><?xml version="1.0" encoding="utf-8"?>
+<?mso-contentType ?>
+<FormTemplates xmlns="http://schemas.microsoft.com/sharepoint/v3/contenttype/forms">
+  <Display>DocumentLibraryForm</Display>
+  <Edit>DocumentLibraryForm</Edit>
+  <New>DocumentLibraryForm</New>
+</FormTemplates>
+</file>
+
+<file path=customXml/item2.xml><?xml version="1.0" encoding="utf-8"?>
+<b:Sources xmlns:b="http://schemas.openxmlformats.org/officeDocument/2006/bibliography" xmlns="http://schemas.openxmlformats.org/officeDocument/2006/bibliography" SelectedStyle="\APASixthEditionOfficeOnline.xsl" StyleName="APA" Version="6"/>
+</file>
+
+<file path=customXml/item3.xml><?xml version="1.0" encoding="utf-8"?>
 <ct:contentTypeSchema xmlns:ct="http://schemas.microsoft.com/office/2006/metadata/contentType" xmlns:ma="http://schemas.microsoft.com/office/2006/metadata/properties/metaAttributes" ct:_="" ma:_="" ma:contentTypeName="Document" ma:contentTypeID="0x010100DDC7FDB1C8256C4EA4678CC05D188078" ma:contentTypeVersion="20" ma:contentTypeDescription="Create a new document." ma:contentTypeScope="" ma:versionID="2a9650d830cc67299a1a440994d8139a">
   <xsd:schema xmlns:xsd="http://www.w3.org/2001/XMLSchema" xmlns:xs="http://www.w3.org/2001/XMLSchema" xmlns:p="http://schemas.microsoft.com/office/2006/metadata/properties" xmlns:ns2="ab9fedca-001d-4cc9-b244-d9c3be5a27d3" xmlns:ns3="42cc25d9-27fe-4f07-accb-ded05ec47eee" targetNamespace="http://schemas.microsoft.com/office/2006/metadata/properties" ma:root="true" ma:fieldsID="b7be75ccca685a650eabb79854d6018f" ns2:_="" ns3:_="">
     <xsd:import namespace="ab9fedca-001d-4cc9-b244-d9c3be5a27d3"/>
@@ -8029,19 +8043,6 @@
 </ct:contentTypeSchema>
 </file>
 
-<file path=customXml/item2.xml><?xml version="1.0" encoding="utf-8"?>
-<b:Sources xmlns:b="http://schemas.openxmlformats.org/officeDocument/2006/bibliography" xmlns="http://schemas.openxmlformats.org/officeDocument/2006/bibliography" SelectedStyle="\APASixthEditionOfficeOnline.xsl" StyleName="APA" Version="6"/>
-</file>
-
-<file path=customXml/item3.xml><?xml version="1.0" encoding="utf-8"?>
-<?mso-contentType ?>
-<FormTemplates xmlns="http://schemas.microsoft.com/sharepoint/v3/contenttype/forms">
-  <Display>DocumentLibraryForm</Display>
-  <Edit>DocumentLibraryForm</Edit>
-  <New>DocumentLibraryForm</New>
-</FormTemplates>
-</file>
-
 <file path=customXml/item4.xml><?xml version="1.0" encoding="utf-8"?>
 <p:properties xmlns:p="http://schemas.microsoft.com/office/2006/metadata/properties" xmlns:xsi="http://www.w3.org/2001/XMLSchema-instance" xmlns:pc="http://schemas.microsoft.com/office/infopath/2007/PartnerControls">
   <documentManagement>
@@ -8055,6 +8056,22 @@
 </file>
 
 <file path=customXml/itemProps1.xml><?xml version="1.0" encoding="utf-8"?>
+<ds:datastoreItem xmlns:ds="http://schemas.openxmlformats.org/officeDocument/2006/customXml" ds:itemID="{F7042B96-2710-4B3A-A921-FC5861D5BFEE}">
+  <ds:schemaRefs>
+    <ds:schemaRef ds:uri="http://schemas.microsoft.com/sharepoint/v3/contenttype/forms"/>
+  </ds:schemaRefs>
+</ds:datastoreItem>
+</file>
+
+<file path=customXml/itemProps2.xml><?xml version="1.0" encoding="utf-8"?>
+<ds:datastoreItem xmlns:ds="http://schemas.openxmlformats.org/officeDocument/2006/customXml" ds:itemID="{3679C442-D341-425F-8964-A65FCEFD3D9B}">
+  <ds:schemaRefs>
+    <ds:schemaRef ds:uri="http://schemas.openxmlformats.org/officeDocument/2006/bibliography"/>
+  </ds:schemaRefs>
+</ds:datastoreItem>
+</file>
+
+<file path=customXml/itemProps3.xml><?xml version="1.0" encoding="utf-8"?>
 <ds:datastoreItem xmlns:ds="http://schemas.openxmlformats.org/officeDocument/2006/customXml" ds:itemID="{057DB1AA-C3CE-4735-A67C-E9A8097C0741}">
   <ds:schemaRefs>
     <ds:schemaRef ds:uri="http://schemas.microsoft.com/office/2006/metadata/contentType"/>
@@ -8073,22 +8090,6 @@
 </ds:datastoreItem>
 </file>
 
-<file path=customXml/itemProps2.xml><?xml version="1.0" encoding="utf-8"?>
-<ds:datastoreItem xmlns:ds="http://schemas.openxmlformats.org/officeDocument/2006/customXml" ds:itemID="{3679C442-D341-425F-8964-A65FCEFD3D9B}">
-  <ds:schemaRefs>
-    <ds:schemaRef ds:uri="http://schemas.openxmlformats.org/officeDocument/2006/bibliography"/>
-  </ds:schemaRefs>
-</ds:datastoreItem>
-</file>
-
-<file path=customXml/itemProps3.xml><?xml version="1.0" encoding="utf-8"?>
-<ds:datastoreItem xmlns:ds="http://schemas.openxmlformats.org/officeDocument/2006/customXml" ds:itemID="{F7042B96-2710-4B3A-A921-FC5861D5BFEE}">
-  <ds:schemaRefs>
-    <ds:schemaRef ds:uri="http://schemas.microsoft.com/sharepoint/v3/contenttype/forms"/>
-  </ds:schemaRefs>
-</ds:datastoreItem>
-</file>
-
 <file path=customXml/itemProps4.xml><?xml version="1.0" encoding="utf-8"?>
 <ds:datastoreItem xmlns:ds="http://schemas.openxmlformats.org/officeDocument/2006/customXml" ds:itemID="{1A4736DD-7889-4919-A280-9BE82A810A58}">
   <ds:schemaRefs>

</xml_diff>